<commit_message>
move examples from 07 to 08 - if using arrays
</commit_message>
<xml_diff>
--- a/08_Arrays/Übungen/CountDifferentDigits/CountDifferentDigits.docx
+++ b/08_Arrays/Übungen/CountDifferentDigits/CountDifferentDigits.docx
@@ -26,6 +26,16 @@
         <w:t>Array</w:t>
       </w:r>
     </w:p>
+    <w:p>
+      <w:pPr>
+        <w:pStyle w:val="Aufzhlung1"/>
+      </w:pPr>
+      <w:r>
+        <w:t>Methoden</w:t>
+      </w:r>
+      <w:bookmarkStart w:id="0" w:name="_GoBack"/>
+      <w:bookmarkEnd w:id="0"/>
+    </w:p>
     <w:p/>
     <w:p>
       <w:r>
@@ -45,8 +55,6 @@
       <w:r>
         <w:t>Ein Abbruch der Eingabe ist nicht vorgesehen!</w:t>
       </w:r>
-      <w:bookmarkStart w:id="0" w:name="_GoBack"/>
-      <w:bookmarkEnd w:id="0"/>
     </w:p>
     <w:p>
       <w:r>
@@ -97,8 +105,8 @@
         </w:rPr>
         <w:drawing>
           <wp:inline distT="0" distB="0" distL="0" distR="0" wp14:anchorId="2A4E5C5A" wp14:editId="63F1E194">
-            <wp:extent cx="5734050" cy="5038725"/>
-            <wp:effectExtent l="0" t="0" r="0" b="9525"/>
+            <wp:extent cx="4149090" cy="3645961"/>
+            <wp:effectExtent l="0" t="0" r="3810" b="0"/>
             <wp:docPr id="1" name="Grafik 1"/>
             <wp:cNvGraphicFramePr>
               <a:graphicFrameLocks xmlns:a="http://schemas.openxmlformats.org/drawingml/2006/main" noChangeAspect="1"/>
@@ -119,7 +127,7 @@
                   <pic:spPr>
                     <a:xfrm>
                       <a:off x="0" y="0"/>
-                      <a:ext cx="5734050" cy="5038725"/>
+                      <a:ext cx="4154091" cy="3650356"/>
                     </a:xfrm>
                     <a:prstGeom prst="rect">
                       <a:avLst/>
@@ -131,6 +139,104 @@
           </wp:inline>
         </w:drawing>
       </w:r>
+    </w:p>
+    <w:p>
+      <w:pPr>
+        <w:ind w:left="708"/>
+      </w:pPr>
+    </w:p>
+    <w:p>
+      <w:r>
+        <w:t xml:space="preserve">Die Methode </w:t>
+      </w:r>
+      <w:r>
+        <w:rPr>
+          <w:rFonts w:ascii="Consolas" w:hAnsi="Consolas" w:cs="Consolas"/>
+          <w:color w:val="0000FF"/>
+          <w:sz w:val="19"/>
+          <w:szCs w:val="19"/>
+          <w:highlight w:val="white"/>
+        </w:rPr>
+        <w:t>public</w:t>
+      </w:r>
+      <w:r>
+        <w:rPr>
+          <w:rFonts w:ascii="Consolas" w:hAnsi="Consolas" w:cs="Consolas"/>
+          <w:color w:val="000000"/>
+          <w:sz w:val="19"/>
+          <w:szCs w:val="19"/>
+          <w:highlight w:val="white"/>
+        </w:rPr>
+        <w:t xml:space="preserve"> </w:t>
+      </w:r>
+      <w:r>
+        <w:rPr>
+          <w:rFonts w:ascii="Consolas" w:hAnsi="Consolas" w:cs="Consolas"/>
+          <w:color w:val="0000FF"/>
+          <w:sz w:val="19"/>
+          <w:szCs w:val="19"/>
+          <w:highlight w:val="white"/>
+        </w:rPr>
+        <w:t>static</w:t>
+      </w:r>
+      <w:r>
+        <w:rPr>
+          <w:rFonts w:ascii="Consolas" w:hAnsi="Consolas" w:cs="Consolas"/>
+          <w:color w:val="000000"/>
+          <w:sz w:val="19"/>
+          <w:szCs w:val="19"/>
+          <w:highlight w:val="white"/>
+        </w:rPr>
+        <w:t xml:space="preserve"> </w:t>
+      </w:r>
+      <w:r>
+        <w:rPr>
+          <w:rFonts w:ascii="Consolas" w:hAnsi="Consolas" w:cs="Consolas"/>
+          <w:color w:val="0000FF"/>
+          <w:sz w:val="19"/>
+          <w:szCs w:val="19"/>
+          <w:highlight w:val="white"/>
+        </w:rPr>
+        <w:t>string</w:t>
+      </w:r>
+      <w:r>
+        <w:rPr>
+          <w:rFonts w:ascii="Consolas" w:hAnsi="Consolas" w:cs="Consolas"/>
+          <w:color w:val="000000"/>
+          <w:sz w:val="19"/>
+          <w:szCs w:val="19"/>
+          <w:highlight w:val="white"/>
+        </w:rPr>
+        <w:t xml:space="preserve"> GetUniqueDigitsString(</w:t>
+      </w:r>
+      <w:r>
+        <w:rPr>
+          <w:rFonts w:ascii="Consolas" w:hAnsi="Consolas" w:cs="Consolas"/>
+          <w:color w:val="0000FF"/>
+          <w:sz w:val="19"/>
+          <w:szCs w:val="19"/>
+          <w:highlight w:val="white"/>
+        </w:rPr>
+        <w:t>int</w:t>
+      </w:r>
+      <w:r>
+        <w:rPr>
+          <w:rFonts w:ascii="Consolas" w:hAnsi="Consolas" w:cs="Consolas"/>
+          <w:color w:val="000000"/>
+          <w:sz w:val="19"/>
+          <w:szCs w:val="19"/>
+          <w:highlight w:val="white"/>
+        </w:rPr>
+        <w:t>[] digits)</w:t>
+      </w:r>
+      <w:r>
+        <w:t xml:space="preserve"> wird über Unittests überprüft. Zerlegen Sie die Aufgabe so in Teilaufgaben, dass zumindest eine weitere Methode entsteht!</w:t>
+      </w:r>
+    </w:p>
+    <w:p>
+      <w:pPr>
+        <w:ind w:left="708"/>
+      </w:pPr>
     </w:p>
     <w:sectPr>
       <w:pgSz w:w="11906" w:h="16838"/>

</xml_diff>